<commit_message>
Update README and strategic brief with testing documentation
- README: add full Testing section (unit tests + LLM evals), updated
  file structure, eval table with all 10 transcripts, known limitation
  note for Dorothy ambiguous case, secrets.toml priority note
- README: update Python prereq to 3.11+, note temperature=0 in arch diagram
- Strategic brief: add Quality Assurance & Testing section covering unit
  test philosophy, eval test design, extraction accuracy checks, and
  documented gap for ambiguous/incomplete cases

Co-Authored-By: Claude Sonnet 4.6 <noreply@anthropic.com>
</commit_message>
<xml_diff>
--- a/Carrum_Strategic_Brief.docx
+++ b/Carrum_Strategic_Brief.docx
@@ -2586,6 +2586,144 @@
           <w:szCs w:val="21"/>
         </w:rPr>
         <w:t xml:space="preserve">Navigator correction data (cases where the extracted fact was overridden) is captured in the finalized JSON output. Aggregating these corrections over time identifies systematic prompt weaknesses and enables targeted few-shot examples to be added to the extraction prompt — improving accuracy without changing the overall system design.</w:t>
+      </w:r>
+    </w:p>
+    <w:p>
+      <w:pPr>
+        <w:pBdr>
+          <w:bottom w:val="single" w:color="1A5276" w:sz="4" w:space="2"/>
+        </w:pBdr>
+        <w:spacing w:after="80" w:before="320"/>
+      </w:pPr>
+      <w:r>
+        <w:rPr>
+          <w:rFonts w:ascii="Arial" w:cs="Arial" w:eastAsia="Arial" w:hAnsi="Arial"/>
+          <w:b/>
+          <w:bCs/>
+          <w:color w:val="1A5276"/>
+          <w:spacing w:val="40"/>
+          <w:sz w:val="18"/>
+          <w:szCs w:val="18"/>
+        </w:rPr>
+        <w:t>QUALITY ASSURANCE &amp; TESTING</w:t>
+      </w:r>
+    </w:p>
+    <w:p>
+      <w:pPr>
+        <w:spacing w:after="80" w:before="80"/>
+      </w:pPr>
+      <w:r>
+        <w:rPr>
+          <w:rFonts w:ascii="Arial" w:cs="Arial" w:eastAsia="Arial" w:hAnsi="Arial"/>
+          <w:color w:val="1C2833"/>
+          <w:sz w:val="21"/>
+          <w:szCs w:val="21"/>
+        </w:rPr>
+        <w:t>The system ships with a two-tier automated test suite that separates concerns in the same way the architecture does: fast, deterministic unit tests verify the rule engine in isolation, and LLM eval tests verify end-to-end extraction accuracy against a hand-authored clinical answer key.</w:t>
+      </w:r>
+    </w:p>
+    <w:p>
+      <w:pPr>
+        <w:spacing w:after="40" w:before="120"/>
+      </w:pPr>
+      <w:r>
+        <w:rPr>
+          <w:rFonts w:ascii="Arial" w:cs="Arial" w:eastAsia="Arial" w:hAnsi="Arial"/>
+          <w:b/>
+          <w:bCs/>
+          <w:color w:val="1A5276"/>
+          <w:sz w:val="21"/>
+          <w:szCs w:val="21"/>
+        </w:rPr>
+        <w:t>Unit Tests — Deterministic Coverage</w:t>
+      </w:r>
+    </w:p>
+    <w:p>
+      <w:pPr>
+        <w:spacing w:after="80" w:before="80"/>
+      </w:pPr>
+      <w:r>
+        <w:rPr>
+          <w:rFonts w:ascii="Arial" w:cs="Arial" w:eastAsia="Arial" w:hAnsi="Arial"/>
+          <w:color w:val="1C2833"/>
+          <w:sz w:val="21"/>
+          <w:szCs w:val="21"/>
+        </w:rPr>
+        <w:t>Forty-five unit tests exercise derive_sop_flags, apply_sop_rules, and determine_overall_status with no API calls. Every boundary condition from the SOP table is covered explicitly: HbA1c = 7.0 must not trigger the Review flag (rule is strictly &gt; 7.0); opioid duration of exactly 3 months must not trigger High Complexity; a quit-smoking date within 3 months must still mark the patient as active for surgical clearance. These tests run in under 2 seconds and are suitable for every commit or CI gate.</w:t>
+      </w:r>
+    </w:p>
+    <w:p>
+      <w:pPr>
+        <w:spacing w:after="40" w:before="120"/>
+      </w:pPr>
+      <w:r>
+        <w:rPr>
+          <w:rFonts w:ascii="Arial" w:cs="Arial" w:eastAsia="Arial" w:hAnsi="Arial"/>
+          <w:b/>
+          <w:bCs/>
+          <w:color w:val="1A5276"/>
+          <w:sz w:val="21"/>
+          <w:szCs w:val="21"/>
+        </w:rPr>
+        <w:t>LLM Eval Tests — Extraction Accuracy</w:t>
+      </w:r>
+    </w:p>
+    <w:p>
+      <w:pPr>
+        <w:spacing w:after="80" w:before="80"/>
+      </w:pPr>
+      <w:r>
+        <w:rPr>
+          <w:rFonts w:ascii="Arial" w:cs="Arial" w:eastAsia="Arial" w:hAnsi="Arial"/>
+          <w:color w:val="1C2833"/>
+          <w:sz w:val="21"/>
+          <w:szCs w:val="21"/>
+        </w:rPr>
+        <w:t>Ten eval tests run the full pipeline against real patient transcripts, each paired with a hand-authored answer key (EVAL_ANSWER_KEY.md). Each test asserts on SOP_Flags and Overall_Case_Status — the stable output surface — rather than raw LLM text, which is non-deterministic by nature. The LLM extraction call uses temperature=0 so results are reproducible across runs. Eval tests are gated behind a --run-evals flag and excluded from the default pytest run to avoid burning API quota on every code change.</w:t>
+      </w:r>
+    </w:p>
+    <w:p>
+      <w:pPr>
+        <w:spacing w:after="80" w:before="80"/>
+      </w:pPr>
+      <w:r>
+        <w:rPr>
+          <w:rFonts w:ascii="Arial" w:cs="Arial" w:eastAsia="Arial" w:hAnsi="Arial"/>
+          <w:color w:val="1C2833"/>
+          <w:sz w:val="21"/>
+          <w:szCs w:val="21"/>
+        </w:rPr>
+        <w:t>The eval suite is designed to catch the class of extraction errors most likely to produce incorrect routing: confusing a gym personal trainer for a licensed physical therapist, treating a wellness nutritionist as a Registered Dietician, misclassifying a non-opioid anti-inflammatory as a controlled substance, or hallucinating certainty in ambiguous transcripts where the patient cannot recall their medication name.</w:t>
+      </w:r>
+    </w:p>
+    <w:p>
+      <w:pPr>
+        <w:spacing w:after="40" w:before="120"/>
+      </w:pPr>
+      <w:r>
+        <w:rPr>
+          <w:rFonts w:ascii="Arial" w:cs="Arial" w:eastAsia="Arial" w:hAnsi="Arial"/>
+          <w:b/>
+          <w:bCs/>
+          <w:color w:val="1A5276"/>
+          <w:sz w:val="21"/>
+          <w:szCs w:val="21"/>
+        </w:rPr>
+        <w:t>Known Quality Gap — Ambiguous Cases</w:t>
+      </w:r>
+    </w:p>
+    <w:p>
+      <w:pPr>
+        <w:spacing w:after="80" w:before="80"/>
+      </w:pPr>
+      <w:r>
+        <w:rPr>
+          <w:rFonts w:ascii="Arial" w:cs="Arial" w:eastAsia="Arial" w:hAnsi="Arial"/>
+          <w:color w:val="1C2833"/>
+          <w:sz w:val="21"/>
+          <w:szCs w:val="21"/>
+        </w:rPr>
+        <w:t>The current schema returns Clear when key fields are null (unknown or unmentioned), which can produce false-negative routing for incomplete transcripts. This is documented in the test suite and flagged for a future schema change: adding an Incomplete or Needs Follow-Up overall status that fires when clinically required fields cannot be resolved from the transcript.</w:t>
       </w:r>
     </w:p>
     <w:p>

</xml_diff>

<commit_message>
Revise strategic brief for accuracy and completeness
- Fix date: April 2025 → April 2026
- Add intro sentences to 4 heading-only sections: Problem Statement,
  SOP Rule Reference, Technology Stack, Risks & Mitigations
- Add bridging sentence in Deterministic Logic section connecting the
  tension description to the hybrid architecture comparison table
- Update Risks table: extraction error row now includes eval suite as
  a mitigation and notes 3 bugs found on first run; PHI row corrected
  from "no data stored" to "no data persisted by the application"
- Update QA section: eval suite described as having already found and
  fixed 3 real extraction gaps, not just designed to catch them
- Update Technology Stack table: "Gemini Flash" → "Gemini 2.5 Flash"

Co-Authored-By: Claude Sonnet 4.6 <noreply@anthropic.com>
</commit_message>
<xml_diff>
--- a/Carrum_Strategic_Brief.docx
+++ b/Carrum_Strategic_Brief.docx
@@ -43,7 +43,7 @@
           <w:sz w:val="18"/>
           <w:szCs w:val="18"/>
         </w:rPr>
-        <w:t xml:space="preserve">Prepared for Carrum Health  |  April 2025  |  Applied AI PM — Technical Case Study</w:t>
+        <w:t>Prepared for Carrum Health  |  April 2026  |  Applied AI PM — Technical Case Study</w:t>
       </w:r>
     </w:p>
     <w:p>
@@ -106,6 +106,20 @@
           <w:szCs w:val="18"/>
         </w:rPr>
         <w:t xml:space="preserve">PROBLEM STATEMENT</w:t>
+      </w:r>
+    </w:p>
+    <w:p>
+      <w:pPr>
+        <w:spacing w:after="80" w:before="80"/>
+      </w:pPr>
+      <w:r>
+        <w:rPr>
+          <w:rFonts w:ascii="Arial" w:cs="Arial" w:eastAsia="Arial" w:hAnsi="Arial"/>
+          <w:color w:val="1C2833"/>
+          <w:sz w:val="21"/>
+          <w:szCs w:val="21"/>
+        </w:rPr>
+        <w:t>The Carrum Care Team manually cross-references each patient transcript against a multi-specialty SOP table to determine surgical eligibility and required actions. At volume, this process is slow, inconsistent, and produces no auditable record of which rule drove each routing decision. The table below summarizes the current-state pain points and the outcomes this system addresses.</w:t>
       </w:r>
     </w:p>
     <w:tbl>
@@ -479,6 +493,22 @@
       <w:pPr>
         <w:spacing w:after="80" w:before="80"/>
       </w:pPr>
+    </w:p>
+    <w:p>
+      <w:pPr>
+        <w:spacing w:after="60" w:before="120"/>
+      </w:pPr>
+      <w:r>
+        <w:rPr>
+          <w:rFonts w:ascii="Arial" w:cs="Arial" w:eastAsia="Arial" w:hAnsi="Arial"/>
+          <w:b/>
+          <w:bCs/>
+          <w:color w:val="1A5276"/>
+          <w:sz w:val="22"/>
+          <w:szCs w:val="22"/>
+        </w:rPr>
+        <w:t>The tension is between flexibility and reliability: the LLM excels at interpreting ambiguous language but cannot guarantee the same output on repeated runs, while deterministic code is rigid but perfectly consistent. The following comparison illustrates why the hybrid design is the correct choice for a clinical routing context:</w:t>
+      </w:r>
     </w:p>
     <w:p>
       <w:pPr>
@@ -1044,6 +1074,22 @@
           <w:szCs w:val="18"/>
         </w:rPr>
         <w:t xml:space="preserve">SOP RULE REFERENCE</w:t>
+      </w:r>
+    </w:p>
+    <w:p>
+      <w:pPr>
+        <w:spacing w:after="60" w:before="120"/>
+      </w:pPr>
+      <w:r>
+        <w:rPr>
+          <w:rFonts w:ascii="Arial" w:cs="Arial" w:eastAsia="Arial" w:hAnsi="Arial"/>
+          <w:b/>
+          <w:bCs/>
+          <w:color w:val="1A5276"/>
+          <w:sz w:val="22"/>
+          <w:szCs w:val="22"/>
+        </w:rPr>
+        <w:t>The following rules are implemented in the current version of the SOP Engine. Each rule is scoped to a case category (General, Joint, or Bariatric) and maps a single boolean flag to a routing status and required action. Adding or modifying a rule requires editing one dictionary entry in logic_engine.py — no model changes needed.</w:t>
       </w:r>
     </w:p>
     <w:tbl>
@@ -2693,7 +2739,7 @@
           <w:sz w:val="21"/>
           <w:szCs w:val="21"/>
         </w:rPr>
-        <w:t>The eval suite is designed to catch the class of extraction errors most likely to produce incorrect routing: confusing a gym personal trainer for a licensed physical therapist, treating a wellness nutritionist as a Registered Dietician, misclassifying a non-opioid anti-inflammatory as a controlled substance, or hallucinating certainty in ambiguous transcripts where the patient cannot recall their medication name.</w:t>
+        <w:t>The eval suite is designed to catch the class of extraction errors most likely to produce incorrect routing: confusing a gym personal trainer for a licensed physical therapist, treating a wellness nutritionist as a Registered Dietician, misclassifying a non-opioid anti-inflammatory as a controlled substance, or hallucinating certainty in ambiguous transcripts. On the initial run, the suite immediately identified 3 real extraction gaps — dental urgency framing, PT session count threshold, and a response token limit causing JSON truncation on longer transcripts — all of which were fixed before production use.</w:t>
       </w:r>
     </w:p>
     <w:p>
@@ -2744,6 +2790,22 @@
           <w:szCs w:val="18"/>
         </w:rPr>
         <w:t xml:space="preserve">TECHNOLOGY STACK</w:t>
+      </w:r>
+    </w:p>
+    <w:p>
+      <w:pPr>
+        <w:spacing w:after="60" w:before="120"/>
+      </w:pPr>
+      <w:r>
+        <w:rPr>
+          <w:rFonts w:ascii="Arial" w:cs="Arial" w:eastAsia="Arial" w:hAnsi="Arial"/>
+          <w:b/>
+          <w:bCs/>
+          <w:color w:val="1A5276"/>
+          <w:sz w:val="22"/>
+          <w:szCs w:val="22"/>
+        </w:rPr>
+        <w:t>Every component was chosen to minimize operational overhead while keeping the architecture open to production hardening — EMR integration, BAA-covered API endpoints, and role-based access can be layered on without restructuring the core pipeline.</w:t>
       </w:r>
     </w:p>
     <w:tbl>
@@ -3007,7 +3069,7 @@
                 <w:sz w:val="19"/>
                 <w:szCs w:val="19"/>
               </w:rPr>
-              <w:t xml:space="preserve">Google Gemini Flash — Fast, cost-efficient instruction following for structured JSON extraction from conversational text; free tier available via Google AI Studio.</w:t>
+              <w:t>Google Gemini 2.5 Flash — Fast, cost-efficient instruction following for structured JSON extraction from conversational text; free tier available via Google AI Studio.</w:t>
             </w:r>
           </w:p>
         </w:tc>
@@ -3217,6 +3279,22 @@
           <w:szCs w:val="18"/>
         </w:rPr>
         <w:t xml:space="preserve">RISKS &amp; MITIGATIONS</w:t>
+      </w:r>
+    </w:p>
+    <w:p>
+      <w:pPr>
+        <w:spacing w:after="60" w:before="120"/>
+      </w:pPr>
+      <w:r>
+        <w:rPr>
+          <w:rFonts w:ascii="Arial" w:cs="Arial" w:eastAsia="Arial" w:hAnsi="Arial"/>
+          <w:b/>
+          <w:bCs/>
+          <w:color w:val="1A5276"/>
+          <w:sz w:val="22"/>
+          <w:szCs w:val="22"/>
+        </w:rPr>
+        <w:t>The following risks were assessed against the current prototype. Mitigations are designed to be layered progressively as the system moves from internal demo to production deployment.</w:t>
       </w:r>
     </w:p>
     <w:tbl>
@@ -3418,7 +3496,7 @@
                 <w:sz w:val="18"/>
                 <w:szCs w:val="18"/>
               </w:rPr>
-              <w:t xml:space="preserve">Human-in-the-loop verification step catches errors before commit</w:t>
+              <w:t>Human-in-the-loop verification catches errors before commit. Automated LLM eval suite (10 transcripts against a hand-authored answer key) runs on demand and has already surfaced and fixed 3 prompt gaps on first run.</w:t>
             </w:r>
           </w:p>
         </w:tc>
@@ -3596,7 +3674,7 @@
                 <w:sz w:val="18"/>
                 <w:szCs w:val="18"/>
               </w:rPr>
-              <w:t xml:space="preserve">Production version routes through BAA-covered API endpoint; no data stored</w:t>
+              <w:t>Production version routes through BAA-covered API endpoint. No transcript data is persisted by the application — transcripts transit the Gemini API only and are not stored server-side.</w:t>
             </w:r>
           </w:p>
         </w:tc>

</xml_diff>